<commit_message>
BPP: integrate supplementary figures/tables as main Figure 5-7/Table 3-11, fix inline reposition, include PNG+TIFF and inline PDF
Co-Authored-By: Tatsuki Onishi <bougtoir@gmail.com>
</commit_message>
<xml_diff>
--- a/medical_accident_its_analysis/manuscript/bpp_title_page.docx
+++ b/medical_accident_its_analysis/manuscript/bpp_title_page.docx
@@ -77,7 +77,7 @@
           <w:rFonts w:ascii="Times New Roman" w:hAnsi="Times New Roman"/>
           <w:sz w:val="24"/>
         </w:rPr>
-        <w:t>Word count: approximately 6270 words in total, including abstract and references; main text excluding abstract and references is approximately 4901 words</w:t>
+        <w:t>Word count: approximately 6502 words in total, including abstract and references; main text excluding abstract and references is approximately 4888 words</w:t>
       </w:r>
     </w:p>
     <w:p>
@@ -113,7 +113,7 @@
           <w:rFonts w:ascii="Times New Roman" w:hAnsi="Times New Roman"/>
           <w:sz w:val="24"/>
         </w:rPr>
-        <w:t>Tables: 2  Figures: 4  Supplementary tables: 9  Supplementary figures: 3</w:t>
+        <w:t>Tables: 11  Figures: 7</w:t>
       </w:r>
     </w:p>
     <w:p>

</xml_diff>